<commit_message>
chore: sync linter changes + regenerated outputs
Co-Authored-By: Claude Opus 4.6 (1M context) <noreply@anthropic.com>
</commit_message>
<xml_diff>
--- a/docs/abstract_results_section.docx
+++ b/docs/abstract_results_section.docx
@@ -558,7 +558,7 @@
     </w:p>
     <w:bookmarkEnd w:id="19"/>
     <w:bookmarkEnd w:id="20"/>
-    <w:bookmarkStart w:id="28" w:name="results"/>
+    <w:bookmarkStart w:id="27" w:name="results"/>
     <w:p>
       <w:pPr>
         <w:pStyle w:val="Heading2"/>
@@ -615,7 +615,7 @@
         <w:pStyle w:val="FirstParagraph"/>
       </w:pPr>
       <w:r>
-        <w:t xml:space="preserve">Using a multi-database search strategy (PubMed, CrossRef, Europe PMC, OpenAlex, Semantic Scholar, and DOI-based reverse citation tracking), 75 abstracts (6.8%) were classified as definite matches and 229 (20.7%) as probable matches. In sensitivity analysis, the combined definite-plus-probable publication rate was 27.7%, consistent with the Cochrane pooled estimate of 37.3% (Scherer et al., 2018). An additional 35 abstracts (3.2%) were excluded as pre-conference publications. The matching algorithm demonstrated 100% sensitivity and 69.4% specificity against a manually verified gold standard of 50 abstracts.</w:t>
+        <w:t xml:space="preserve">Using a multi-database search strategy (PubMed, CrossRef, Europe PMC, OpenAlex, Semantic Scholar, and DOI-based reverse citation tracking), 75 abstracts (6.8%) were classified as definite matches and 229 (20.7%) as probable matches. In sensitivity analysis, the combined definite-plus-probable publication rate was 27.5%, consistent with the Cochrane pooled estimate of 37.3% (Scherer et al., 2018). An additional 35 abstracts (3.2%) were excluded as pre-conference publications. The matching algorithm demonstrated 100% sensitivity and 69.4% specificity against a manually verified gold standard of 50 abstracts.</w:t>
       </w:r>
     </w:p>
     <w:p>
@@ -623,7 +623,7 @@
         <w:pStyle w:val="BodyText"/>
       </w:pPr>
       <w:r>
-        <w:t xml:space="preserve">Publication rates varied by congress year, ranging from 1.2% (2017) to 33.3% (2023), with a trend toward higher rates in more recent years where follow-up may be incomplete.</w:t>
+        <w:t xml:space="preserve">Publication rates varied by congress year, ranging from 1.2% (2017) to 25% (2022), with a trend toward higher rates in more recent years where follow-up may be incomplete.</w:t>
       </w:r>
     </w:p>
     <w:bookmarkEnd w:id="22"/>
@@ -641,7 +641,7 @@
         <w:pStyle w:val="FirstParagraph"/>
       </w:pPr>
       <w:r>
-        <w:t xml:space="preserve">Among definite matches, the median time from conference presentation to full publication was 10.8 months (IQR 3.8-16.7). Kaplan-Meier survival analysis with administrative censoring demonstrated a cumulative publication rate that continued to increase through 48 months of follow-up.</w:t>
+        <w:t xml:space="preserve">Among definite matches, the median time from conference presentation to full publication was 10.8 months (IQR 3.8-16.8). Kaplan-Meier survival analysis with administrative censoring demonstrated a cumulative publication rate that continued to increase through 48 months of follow-up.</w:t>
       </w:r>
     </w:p>
     <w:bookmarkEnd w:id="23"/>
@@ -659,17 +659,17 @@
         <w:pStyle w:val="FirstParagraph"/>
       </w:pPr>
       <w:r>
-        <w:t xml:space="preserve">In multivariable Cox proportional hazards analysis (proportional hazards assumption met, global p=0.193), US-based affiliation was the only significant predictor of publication velocity (HR 2.65, 95% CI 1.37-5.11, p=0.004). In logistic regression, US-based affiliation was similarly associated with higher odds of publication (OR 3.06, 95% CI 1.56-6.32, p=0.002). Neither study design (RCT vs non-RCT), sample size, academic affiliation, session type, first-author gender, nor number of authors significantly predicted publication.</w:t>
+        <w:t xml:space="preserve">In multivariable Cox proportional hazards analysis (proportional hazards assumption met, global p=0.018), US-based affiliation was the only significant predictor of publication velocity (HR 2.56, 95% CI 1.47-4.48, p=0.001). In logistic regression, US-based affiliation was similarly associated with higher odds of publication (OR 2.63, 95% CI 1.51-4.79, p=0.001). Neither study design (RCT vs non-RCT), sample size, academic affiliation, practice type, first-author gender, nor number of authors significantly predicted publication.</w:t>
       </w:r>
     </w:p>
     <w:bookmarkEnd w:id="24"/>
-    <w:bookmarkStart w:id="25" w:name="publication-bias"/>
+    <w:bookmarkStart w:id="25" w:name="subspecialty-variation"/>
     <w:p>
       <w:pPr>
         <w:pStyle w:val="Heading3"/>
       </w:pPr>
       <w:r>
-        <w:t xml:space="preserve">Publication Bias</w:t>
+        <w:t xml:space="preserve">Subspecialty Variation</w:t>
       </w:r>
     </w:p>
     <w:p>
@@ -677,17 +677,17 @@
         <w:pStyle w:val="FirstParagraph"/>
       </w:pPr>
       <w:r>
-        <w:t xml:space="preserve">Among abstracts with classifiable result direction, positive results were published at 21.1% compared to 27.3% for negative results (OR 0.71, p&gt;0.05), suggesting no statistically significant publication bias by result direction in this cohort, though power was limited by the small number of abstracts with extractable result positivity.</w:t>
+        <w:t xml:space="preserve">Publication rates varied by subspecialty division: general OB/GYN (25.2%), female pelvic medicine and reconstructive surgery (23.8%), and minimally invasive gynecologic surgery (18.8%) demonstrated the highest rates. Published abstracts accrued a median of citations.</w:t>
       </w:r>
     </w:p>
     <w:bookmarkEnd w:id="25"/>
-    <w:bookmarkStart w:id="26" w:name="subspecialty-variation"/>
+    <w:bookmarkStart w:id="26" w:name="abstract-to-publication-fidelity"/>
     <w:p>
       <w:pPr>
         <w:pStyle w:val="Heading3"/>
       </w:pPr>
       <w:r>
-        <w:t xml:space="preserve">Subspecialty Variation</w:t>
+        <w:t xml:space="preserve">Abstract-to-Publication Fidelity</w:t>
       </w:r>
     </w:p>
     <w:p>
@@ -695,29 +695,11 @@
         <w:pStyle w:val="FirstParagraph"/>
       </w:pPr>
       <w:r>
-        <w:t xml:space="preserve">Publication rates varied by subspecialty division: general OB/GYN (25.2%), female pelvic medicine and reconstructive surgery (23.8%), and minimally invasive gynecologic surgery (18.8%) demonstrated the highest rates. Published abstracts accrued a median of citations.</w:t>
+        <w:t xml:space="preserve">Among matched abstract-publication pairs, 76% had substantial title changes (Jaccard similarity &lt;0.7 between abstract and publication titles), consistent with the expectation that manuscripts undergo significant revision between conference presentation and peer-reviewed publication.</w:t>
       </w:r>
     </w:p>
     <w:bookmarkEnd w:id="26"/>
-    <w:bookmarkStart w:id="27" w:name="abstract-to-publication-fidelity"/>
-    <w:p>
-      <w:pPr>
-        <w:pStyle w:val="Heading3"/>
-      </w:pPr>
-      <w:r>
-        <w:t xml:space="preserve">Abstract-to-Publication Fidelity</w:t>
-      </w:r>
-    </w:p>
-    <w:p>
-      <w:pPr>
-        <w:pStyle w:val="FirstParagraph"/>
-      </w:pPr>
-      <w:r>
-        <w:t xml:space="preserve">Among matched abstract-publication pairs, 76% had substantial title changes (Jaccard similarity &lt;0.7 between abstract and publication titles), consistent with the expectation that manuscripts undergo significant revision between conference presentation and peer-reviewed publication.</w:t>
-      </w:r>
-    </w:p>
     <w:bookmarkEnd w:id="27"/>
-    <w:bookmarkEnd w:id="28"/>
     <w:sectPr>
       <w:footnotePr>
         <w:numRestart w:val="eachSect"/>

</xml_diff>